<commit_message>
chore: extend labs list (#11)
* add: new OS and security course content with automated verifications

- Include drafts for three new labs and one control work in Ukrainian
- Add comprehensive CONTENT-AUDIT.md report with identified issues and fixes
- Introduce `verify-examples.mjs` script for automated validation of code snippets
- Ensure alignment across examples, outputs, and their descriptions

* add: OS curriculum map and programs for Ukrainian groups

- Introduce `CURRICULUM-MAP.md` for load distribution, group alignment, and content consistency checks
- Add `_programs.json` containing detailed lecture, lab, and seminar schedules for each group
- Ensure all groups and plans have corresponding content mappings
- Highlight mismatches in lab numbering, group-specific topics, and lecture/self-study hours
</commit_message>
<xml_diff>
--- a/public/labs/pmzi/ЛР2_ПМЗІ_Шифр_Цезаря_з_ключовим_словом_Афінний_шифр.docx
+++ b/public/labs/pmzi/ЛР2_ПМЗІ_Шифр_Цезаря_з_ключовим_словом_Афінний_шифр.docx
@@ -15,7 +15,7 @@
         <w:pStyle w:val="Subtitle"/>
       </w:pPr>
       <w:r>
-        <w:t xml:space="preserve">Шифр Цезаря з ключовим словом. Афінний шифр</w:t>
+        <w:t xml:space="preserve">Використання шифру Цезаря з ключовим словом, Афінної системи підстановки Цезаря при розв'язанні задачі захисту інформації. Програмна реалізація</w:t>
       </w:r>
     </w:p>
     <w:p>
@@ -51,7 +51,7 @@
         <w:t xml:space="preserve"> </w:t>
       </w:r>
       <w:r>
-        <w:t xml:space="preserve">ПК з встановленим C++ компілятором або Python 3; Середовище розробки (Visual Studio, VS Code).</w:t>
+        <w:t xml:space="preserve">ПК з встановленим C++ компілятором (MSVC, MinGW або GCC); Середовище розробки (Visual Studio, VS Code).</w:t>
       </w:r>
     </w:p>
     <w:p>
@@ -373,7 +373,7 @@
         <w:rPr>
           <w:rStyle w:val="VerbatimChar"/>
         </w:rPr>
-        <w:t xml:space="preserve">│  gcd(a, 26) = 1 для: 1, 3, 5, 7, 9, 11, 15, 17, 19, 21, 23, 25       │</w:t>
+        <w:t xml:space="preserve">│  gcd(a, 26) = 1 для: 1, 3, 5, 7, 9, 11, 15, 17, 19, 21, 23, 25        │</w:t>
       </w:r>
       <w:r>
         <w:br/>
@@ -500,13 +500,13 @@
         <w:t xml:space="preserve">Приклад виконання</w:t>
       </w:r>
     </w:p>
-    <w:bookmarkStart w:id="13" w:name="крок-1.-шифр-з-ключовим-словом-python"/>
+    <w:bookmarkStart w:id="13" w:name="крок-1.-шифр-з-ключовим-словом"/>
     <w:p>
       <w:pPr>
         <w:pStyle w:val="Heading3"/>
       </w:pPr>
       <w:r>
-        <w:t xml:space="preserve">Крок 1. Шифр з ключовим словом (Python)</w:t>
+        <w:t xml:space="preserve">Крок 1. Шифр з ключовим словом</w:t>
       </w:r>
     </w:p>
     <w:p>
@@ -517,466 +517,656 @@
         <w:rPr>
           <w:rStyle w:val="VerbatimChar"/>
         </w:rPr>
-        <w:t xml:space="preserve">def create_keyword_alphabet(keyword: str) -&gt; str:</w:t>
-      </w:r>
-      <w:r>
-        <w:br/>
-      </w:r>
-      <w:r>
-        <w:rPr>
-          <w:rStyle w:val="VerbatimChar"/>
-        </w:rPr>
-        <w:t xml:space="preserve">    """Створює алфавіт з ключовим словом."""</w:t>
-      </w:r>
-      <w:r>
-        <w:br/>
-      </w:r>
-      <w:r>
-        <w:rPr>
-          <w:rStyle w:val="VerbatimChar"/>
-        </w:rPr>
-        <w:t xml:space="preserve">    # Видаляємо повтори з ключа</w:t>
-      </w:r>
-      <w:r>
-        <w:br/>
-      </w:r>
-      <w:r>
-        <w:rPr>
-          <w:rStyle w:val="VerbatimChar"/>
-        </w:rPr>
-        <w:t xml:space="preserve">    seen = set()</w:t>
-      </w:r>
-      <w:r>
-        <w:br/>
-      </w:r>
-      <w:r>
-        <w:rPr>
-          <w:rStyle w:val="VerbatimChar"/>
-        </w:rPr>
-        <w:t xml:space="preserve">    key_chars = []</w:t>
-      </w:r>
-      <w:r>
-        <w:br/>
-      </w:r>
-      <w:r>
-        <w:rPr>
-          <w:rStyle w:val="VerbatimChar"/>
-        </w:rPr>
-        <w:t xml:space="preserve">    for c in keyword.upper():</w:t>
-      </w:r>
-      <w:r>
-        <w:br/>
-      </w:r>
-      <w:r>
-        <w:rPr>
-          <w:rStyle w:val="VerbatimChar"/>
-        </w:rPr>
-        <w:t xml:space="preserve">        if c.isalpha() and c not in seen:</w:t>
-      </w:r>
-      <w:r>
-        <w:br/>
-      </w:r>
-      <w:r>
-        <w:rPr>
-          <w:rStyle w:val="VerbatimChar"/>
-        </w:rPr>
-        <w:t xml:space="preserve">            seen.add(c)</w:t>
-      </w:r>
-      <w:r>
-        <w:br/>
-      </w:r>
-      <w:r>
-        <w:rPr>
-          <w:rStyle w:val="VerbatimChar"/>
-        </w:rPr>
-        <w:t xml:space="preserve">            key_chars.append(c)</w:t>
-      </w:r>
-      <w:r>
-        <w:br/>
-      </w:r>
-      <w:r>
-        <w:br/>
-      </w:r>
-      <w:r>
-        <w:rPr>
-          <w:rStyle w:val="VerbatimChar"/>
-        </w:rPr>
-        <w:t xml:space="preserve">    # Додаємо решту літер</w:t>
-      </w:r>
-      <w:r>
-        <w:br/>
-      </w:r>
-      <w:r>
-        <w:rPr>
-          <w:rStyle w:val="VerbatimChar"/>
-        </w:rPr>
-        <w:t xml:space="preserve">    for c in 'ABCDEFGHIJKLMNOPQRSTUVWXYZ':</w:t>
-      </w:r>
-      <w:r>
-        <w:br/>
-      </w:r>
-      <w:r>
-        <w:rPr>
-          <w:rStyle w:val="VerbatimChar"/>
-        </w:rPr>
-        <w:t xml:space="preserve">        if c not in seen:</w:t>
-      </w:r>
-      <w:r>
-        <w:br/>
-      </w:r>
-      <w:r>
-        <w:rPr>
-          <w:rStyle w:val="VerbatimChar"/>
-        </w:rPr>
-        <w:t xml:space="preserve">            key_chars.append(c)</w:t>
-      </w:r>
-      <w:r>
-        <w:br/>
-      </w:r>
-      <w:r>
-        <w:br/>
-      </w:r>
-      <w:r>
-        <w:rPr>
-          <w:rStyle w:val="VerbatimChar"/>
-        </w:rPr>
-        <w:t xml:space="preserve">    return ''.join(key_chars)</w:t>
-      </w:r>
-      <w:r>
-        <w:br/>
-      </w:r>
-      <w:r>
-        <w:br/>
-      </w:r>
-      <w:r>
-        <w:rPr>
-          <w:rStyle w:val="VerbatimChar"/>
-        </w:rPr>
-        <w:t xml:space="preserve">def keyword_cipher_encrypt(plaintext: str, keyword: str) -&gt; str:</w:t>
-      </w:r>
-      <w:r>
-        <w:br/>
-      </w:r>
-      <w:r>
-        <w:rPr>
-          <w:rStyle w:val="VerbatimChar"/>
-        </w:rPr>
-        <w:t xml:space="preserve">    """Шифрування шифром з ключовим словом."""</w:t>
-      </w:r>
-      <w:r>
-        <w:br/>
-      </w:r>
-      <w:r>
-        <w:rPr>
-          <w:rStyle w:val="VerbatimChar"/>
-        </w:rPr>
-        <w:t xml:space="preserve">    alphabet = 'ABCDEFGHIJKLMNOPQRSTUVWXYZ'</w:t>
-      </w:r>
-      <w:r>
-        <w:br/>
-      </w:r>
-      <w:r>
-        <w:rPr>
-          <w:rStyle w:val="VerbatimChar"/>
-        </w:rPr>
-        <w:t xml:space="preserve">    cipher_alphabet = create_keyword_alphabet(keyword)</w:t>
-      </w:r>
-      <w:r>
-        <w:br/>
-      </w:r>
-      <w:r>
-        <w:br/>
-      </w:r>
-      <w:r>
-        <w:rPr>
-          <w:rStyle w:val="VerbatimChar"/>
-        </w:rPr>
-        <w:t xml:space="preserve">    result = []</w:t>
-      </w:r>
-      <w:r>
-        <w:br/>
-      </w:r>
-      <w:r>
-        <w:rPr>
-          <w:rStyle w:val="VerbatimChar"/>
-        </w:rPr>
-        <w:t xml:space="preserve">    for c in plaintext.upper():</w:t>
-      </w:r>
-      <w:r>
-        <w:br/>
-      </w:r>
-      <w:r>
-        <w:rPr>
-          <w:rStyle w:val="VerbatimChar"/>
-        </w:rPr>
-        <w:t xml:space="preserve">        if c.isalpha():</w:t>
-      </w:r>
-      <w:r>
-        <w:br/>
-      </w:r>
-      <w:r>
-        <w:rPr>
-          <w:rStyle w:val="VerbatimChar"/>
-        </w:rPr>
-        <w:t xml:space="preserve">            idx = alphabet.index(c)</w:t>
-      </w:r>
-      <w:r>
-        <w:br/>
-      </w:r>
-      <w:r>
-        <w:rPr>
-          <w:rStyle w:val="VerbatimChar"/>
-        </w:rPr>
-        <w:t xml:space="preserve">            result.append(cipher_alphabet[idx])</w:t>
-      </w:r>
-      <w:r>
-        <w:br/>
-      </w:r>
-      <w:r>
-        <w:rPr>
-          <w:rStyle w:val="VerbatimChar"/>
-        </w:rPr>
-        <w:t xml:space="preserve">        else:</w:t>
-      </w:r>
-      <w:r>
-        <w:br/>
-      </w:r>
-      <w:r>
-        <w:rPr>
-          <w:rStyle w:val="VerbatimChar"/>
-        </w:rPr>
-        <w:t xml:space="preserve">            result.append(c)</w:t>
-      </w:r>
-      <w:r>
-        <w:br/>
-      </w:r>
-      <w:r>
-        <w:br/>
-      </w:r>
-      <w:r>
-        <w:rPr>
-          <w:rStyle w:val="VerbatimChar"/>
-        </w:rPr>
-        <w:t xml:space="preserve">    return ''.join(result)</w:t>
-      </w:r>
-      <w:r>
-        <w:br/>
-      </w:r>
-      <w:r>
-        <w:br/>
-      </w:r>
-      <w:r>
-        <w:rPr>
-          <w:rStyle w:val="VerbatimChar"/>
-        </w:rPr>
-        <w:t xml:space="preserve">def keyword_cipher_decrypt(ciphertext: str, keyword: str) -&gt; str:</w:t>
-      </w:r>
-      <w:r>
-        <w:br/>
-      </w:r>
-      <w:r>
-        <w:rPr>
-          <w:rStyle w:val="VerbatimChar"/>
-        </w:rPr>
-        <w:t xml:space="preserve">    """Дешифрування шифром з ключовим словом."""</w:t>
-      </w:r>
-      <w:r>
-        <w:br/>
-      </w:r>
-      <w:r>
-        <w:rPr>
-          <w:rStyle w:val="VerbatimChar"/>
-        </w:rPr>
-        <w:t xml:space="preserve">    alphabet = 'ABCDEFGHIJKLMNOPQRSTUVWXYZ'</w:t>
-      </w:r>
-      <w:r>
-        <w:br/>
-      </w:r>
-      <w:r>
-        <w:rPr>
-          <w:rStyle w:val="VerbatimChar"/>
-        </w:rPr>
-        <w:t xml:space="preserve">    cipher_alphabet = create_keyword_alphabet(keyword)</w:t>
-      </w:r>
-      <w:r>
-        <w:br/>
-      </w:r>
-      <w:r>
-        <w:br/>
-      </w:r>
-      <w:r>
-        <w:rPr>
-          <w:rStyle w:val="VerbatimChar"/>
-        </w:rPr>
-        <w:t xml:space="preserve">    result = []</w:t>
-      </w:r>
-      <w:r>
-        <w:br/>
-      </w:r>
-      <w:r>
-        <w:rPr>
-          <w:rStyle w:val="VerbatimChar"/>
-        </w:rPr>
-        <w:t xml:space="preserve">    for c in ciphertext.upper():</w:t>
-      </w:r>
-      <w:r>
-        <w:br/>
-      </w:r>
-      <w:r>
-        <w:rPr>
-          <w:rStyle w:val="VerbatimChar"/>
-        </w:rPr>
-        <w:t xml:space="preserve">        if c.isalpha():</w:t>
-      </w:r>
-      <w:r>
-        <w:br/>
-      </w:r>
-      <w:r>
-        <w:rPr>
-          <w:rStyle w:val="VerbatimChar"/>
-        </w:rPr>
-        <w:t xml:space="preserve">            idx = cipher_alphabet.index(c)</w:t>
-      </w:r>
-      <w:r>
-        <w:br/>
-      </w:r>
-      <w:r>
-        <w:rPr>
-          <w:rStyle w:val="VerbatimChar"/>
-        </w:rPr>
-        <w:t xml:space="preserve">            result.append(alphabet[idx])</w:t>
-      </w:r>
-      <w:r>
-        <w:br/>
-      </w:r>
-      <w:r>
-        <w:rPr>
-          <w:rStyle w:val="VerbatimChar"/>
-        </w:rPr>
-        <w:t xml:space="preserve">        else:</w:t>
-      </w:r>
-      <w:r>
-        <w:br/>
-      </w:r>
-      <w:r>
-        <w:rPr>
-          <w:rStyle w:val="VerbatimChar"/>
-        </w:rPr>
-        <w:t xml:space="preserve">            result.append(c)</w:t>
-      </w:r>
-      <w:r>
-        <w:br/>
-      </w:r>
-      <w:r>
-        <w:br/>
-      </w:r>
-      <w:r>
-        <w:rPr>
-          <w:rStyle w:val="VerbatimChar"/>
-        </w:rPr>
-        <w:t xml:space="preserve">    return ''.join(result)</w:t>
-      </w:r>
-      <w:r>
-        <w:br/>
-      </w:r>
-      <w:r>
-        <w:br/>
-      </w:r>
-      <w:r>
-        <w:rPr>
-          <w:rStyle w:val="VerbatimChar"/>
-        </w:rPr>
-        <w:t xml:space="preserve"># Демонстрація</w:t>
-      </w:r>
-      <w:r>
-        <w:br/>
-      </w:r>
-      <w:r>
-        <w:rPr>
-          <w:rStyle w:val="VerbatimChar"/>
-        </w:rPr>
-        <w:t xml:space="preserve">keyword = "CIPHER"</w:t>
-      </w:r>
-      <w:r>
-        <w:br/>
-      </w:r>
-      <w:r>
-        <w:rPr>
-          <w:rStyle w:val="VerbatimChar"/>
-        </w:rPr>
-        <w:t xml:space="preserve">plaintext = "HELLO WORLD"</w:t>
-      </w:r>
-      <w:r>
-        <w:br/>
-      </w:r>
-      <w:r>
-        <w:br/>
-      </w:r>
-      <w:r>
-        <w:rPr>
-          <w:rStyle w:val="VerbatimChar"/>
-        </w:rPr>
-        <w:t xml:space="preserve">print(f"Ключове слово: {keyword}")</w:t>
-      </w:r>
-      <w:r>
-        <w:br/>
-      </w:r>
-      <w:r>
-        <w:rPr>
-          <w:rStyle w:val="VerbatimChar"/>
-        </w:rPr>
-        <w:t xml:space="preserve">print(f"Алфавіт: {create_keyword_alphabet(keyword)}")</w:t>
-      </w:r>
-      <w:r>
-        <w:br/>
-      </w:r>
-      <w:r>
-        <w:rPr>
-          <w:rStyle w:val="VerbatimChar"/>
-        </w:rPr>
-        <w:t xml:space="preserve">print(f"Відкритий текст: {plaintext}")</w:t>
-      </w:r>
-      <w:r>
-        <w:br/>
-      </w:r>
-      <w:r>
-        <w:br/>
-      </w:r>
-      <w:r>
-        <w:rPr>
-          <w:rStyle w:val="VerbatimChar"/>
-        </w:rPr>
-        <w:t xml:space="preserve">ciphertext = keyword_cipher_encrypt(plaintext, keyword)</w:t>
-      </w:r>
-      <w:r>
-        <w:br/>
-      </w:r>
-      <w:r>
-        <w:rPr>
-          <w:rStyle w:val="VerbatimChar"/>
-        </w:rPr>
-        <w:t xml:space="preserve">print(f"Шифротекст: {ciphertext}")</w:t>
-      </w:r>
-      <w:r>
-        <w:br/>
-      </w:r>
-      <w:r>
-        <w:br/>
-      </w:r>
-      <w:r>
-        <w:rPr>
-          <w:rStyle w:val="VerbatimChar"/>
-        </w:rPr>
-        <w:t xml:space="preserve">decrypted = keyword_cipher_decrypt(ciphertext, keyword)</w:t>
-      </w:r>
-      <w:r>
-        <w:br/>
-      </w:r>
-      <w:r>
-        <w:rPr>
-          <w:rStyle w:val="VerbatimChar"/>
-        </w:rPr>
-        <w:t xml:space="preserve">print(f"Розшифровано: {decrypted}")</w:t>
+        <w:t xml:space="preserve">#include &lt;iostream&gt;</w:t>
+      </w:r>
+      <w:r>
+        <w:br/>
+      </w:r>
+      <w:r>
+        <w:rPr>
+          <w:rStyle w:val="VerbatimChar"/>
+        </w:rPr>
+        <w:t xml:space="preserve">#include &lt;string&gt;</w:t>
+      </w:r>
+      <w:r>
+        <w:br/>
+      </w:r>
+      <w:r>
+        <w:rPr>
+          <w:rStyle w:val="VerbatimChar"/>
+        </w:rPr>
+        <w:t xml:space="preserve">#include &lt;cctype&gt;</w:t>
+      </w:r>
+      <w:r>
+        <w:br/>
+      </w:r>
+      <w:r>
+        <w:br/>
+      </w:r>
+      <w:r>
+        <w:rPr>
+          <w:rStyle w:val="VerbatimChar"/>
+        </w:rPr>
+        <w:t xml:space="preserve">const std::string ALPHABET = "ABCDEFGHIJKLMNOPQRSTUVWXYZ";</w:t>
+      </w:r>
+      <w:r>
+        <w:br/>
+      </w:r>
+      <w:r>
+        <w:br/>
+      </w:r>
+      <w:r>
+        <w:rPr>
+          <w:rStyle w:val="VerbatimChar"/>
+        </w:rPr>
+        <w:t xml:space="preserve">// Формує шифрувальний алфавіт: спершу літери ключа без повторів, далі решта</w:t>
+      </w:r>
+      <w:r>
+        <w:br/>
+      </w:r>
+      <w:r>
+        <w:rPr>
+          <w:rStyle w:val="VerbatimChar"/>
+        </w:rPr>
+        <w:t xml:space="preserve">std::string createKeywordAlphabet(const std::string&amp; keyword) {</w:t>
+      </w:r>
+      <w:r>
+        <w:br/>
+      </w:r>
+      <w:r>
+        <w:rPr>
+          <w:rStyle w:val="VerbatimChar"/>
+        </w:rPr>
+        <w:t xml:space="preserve">    bool used[26] = { false };</w:t>
+      </w:r>
+      <w:r>
+        <w:br/>
+      </w:r>
+      <w:r>
+        <w:rPr>
+          <w:rStyle w:val="VerbatimChar"/>
+        </w:rPr>
+        <w:t xml:space="preserve">    std::string cipherAlphabet;</w:t>
+      </w:r>
+      <w:r>
+        <w:br/>
+      </w:r>
+      <w:r>
+        <w:br/>
+      </w:r>
+      <w:r>
+        <w:rPr>
+          <w:rStyle w:val="VerbatimChar"/>
+        </w:rPr>
+        <w:t xml:space="preserve">    for (char c : keyword) {</w:t>
+      </w:r>
+      <w:r>
+        <w:br/>
+      </w:r>
+      <w:r>
+        <w:rPr>
+          <w:rStyle w:val="VerbatimChar"/>
+        </w:rPr>
+        <w:t xml:space="preserve">        char up = static_cast&lt;char&gt;(std::toupper(static_cast&lt;unsigned char&gt;(c)));</w:t>
+      </w:r>
+      <w:r>
+        <w:br/>
+      </w:r>
+      <w:r>
+        <w:rPr>
+          <w:rStyle w:val="VerbatimChar"/>
+        </w:rPr>
+        <w:t xml:space="preserve">        if (up &gt;= 'A' &amp;&amp; up &lt;= 'Z' &amp;&amp; !used[up - 'A']) {</w:t>
+      </w:r>
+      <w:r>
+        <w:br/>
+      </w:r>
+      <w:r>
+        <w:rPr>
+          <w:rStyle w:val="VerbatimChar"/>
+        </w:rPr>
+        <w:t xml:space="preserve">            used[up - 'A'] = true;</w:t>
+      </w:r>
+      <w:r>
+        <w:br/>
+      </w:r>
+      <w:r>
+        <w:rPr>
+          <w:rStyle w:val="VerbatimChar"/>
+        </w:rPr>
+        <w:t xml:space="preserve">            cipherAlphabet += up;</w:t>
+      </w:r>
+      <w:r>
+        <w:br/>
+      </w:r>
+      <w:r>
+        <w:rPr>
+          <w:rStyle w:val="VerbatimChar"/>
+        </w:rPr>
+        <w:t xml:space="preserve">        }</w:t>
+      </w:r>
+      <w:r>
+        <w:br/>
+      </w:r>
+      <w:r>
+        <w:rPr>
+          <w:rStyle w:val="VerbatimChar"/>
+        </w:rPr>
+        <w:t xml:space="preserve">    }</w:t>
+      </w:r>
+      <w:r>
+        <w:br/>
+      </w:r>
+      <w:r>
+        <w:br/>
+      </w:r>
+      <w:r>
+        <w:rPr>
+          <w:rStyle w:val="VerbatimChar"/>
+        </w:rPr>
+        <w:t xml:space="preserve">    for (char c : ALPHABET) {</w:t>
+      </w:r>
+      <w:r>
+        <w:br/>
+      </w:r>
+      <w:r>
+        <w:rPr>
+          <w:rStyle w:val="VerbatimChar"/>
+        </w:rPr>
+        <w:t xml:space="preserve">        if (!used[c - 'A']) {</w:t>
+      </w:r>
+      <w:r>
+        <w:br/>
+      </w:r>
+      <w:r>
+        <w:rPr>
+          <w:rStyle w:val="VerbatimChar"/>
+        </w:rPr>
+        <w:t xml:space="preserve">            cipherAlphabet += c;</w:t>
+      </w:r>
+      <w:r>
+        <w:br/>
+      </w:r>
+      <w:r>
+        <w:rPr>
+          <w:rStyle w:val="VerbatimChar"/>
+        </w:rPr>
+        <w:t xml:space="preserve">        }</w:t>
+      </w:r>
+      <w:r>
+        <w:br/>
+      </w:r>
+      <w:r>
+        <w:rPr>
+          <w:rStyle w:val="VerbatimChar"/>
+        </w:rPr>
+        <w:t xml:space="preserve">    }</w:t>
+      </w:r>
+      <w:r>
+        <w:br/>
+      </w:r>
+      <w:r>
+        <w:br/>
+      </w:r>
+      <w:r>
+        <w:rPr>
+          <w:rStyle w:val="VerbatimChar"/>
+        </w:rPr>
+        <w:t xml:space="preserve">    return cipherAlphabet;</w:t>
+      </w:r>
+      <w:r>
+        <w:br/>
+      </w:r>
+      <w:r>
+        <w:rPr>
+          <w:rStyle w:val="VerbatimChar"/>
+        </w:rPr>
+        <w:t xml:space="preserve">}</w:t>
+      </w:r>
+      <w:r>
+        <w:br/>
+      </w:r>
+      <w:r>
+        <w:br/>
+      </w:r>
+      <w:r>
+        <w:rPr>
+          <w:rStyle w:val="VerbatimChar"/>
+        </w:rPr>
+        <w:t xml:space="preserve">// Зашифрування: літера відкритого тексту замінюється літерою з тієї самої позиції</w:t>
+      </w:r>
+      <w:r>
+        <w:br/>
+      </w:r>
+      <w:r>
+        <w:rPr>
+          <w:rStyle w:val="VerbatimChar"/>
+        </w:rPr>
+        <w:t xml:space="preserve">std::string keywordEncrypt(const std::string&amp; text, const std::string&amp; keyword) {</w:t>
+      </w:r>
+      <w:r>
+        <w:br/>
+      </w:r>
+      <w:r>
+        <w:rPr>
+          <w:rStyle w:val="VerbatimChar"/>
+        </w:rPr>
+        <w:t xml:space="preserve">    std::string cipherAlphabet = createKeywordAlphabet(keyword);</w:t>
+      </w:r>
+      <w:r>
+        <w:br/>
+      </w:r>
+      <w:r>
+        <w:rPr>
+          <w:rStyle w:val="VerbatimChar"/>
+        </w:rPr>
+        <w:t xml:space="preserve">    std::string result;</w:t>
+      </w:r>
+      <w:r>
+        <w:br/>
+      </w:r>
+      <w:r>
+        <w:br/>
+      </w:r>
+      <w:r>
+        <w:rPr>
+          <w:rStyle w:val="VerbatimChar"/>
+        </w:rPr>
+        <w:t xml:space="preserve">    for (char c : text) {</w:t>
+      </w:r>
+      <w:r>
+        <w:br/>
+      </w:r>
+      <w:r>
+        <w:rPr>
+          <w:rStyle w:val="VerbatimChar"/>
+        </w:rPr>
+        <w:t xml:space="preserve">        char up = static_cast&lt;char&gt;(std::toupper(static_cast&lt;unsigned char&gt;(c)));</w:t>
+      </w:r>
+      <w:r>
+        <w:br/>
+      </w:r>
+      <w:r>
+        <w:rPr>
+          <w:rStyle w:val="VerbatimChar"/>
+        </w:rPr>
+        <w:t xml:space="preserve">        if (up &gt;= 'A' &amp;&amp; up &lt;= 'Z') {</w:t>
+      </w:r>
+      <w:r>
+        <w:br/>
+      </w:r>
+      <w:r>
+        <w:rPr>
+          <w:rStyle w:val="VerbatimChar"/>
+        </w:rPr>
+        <w:t xml:space="preserve">            result += cipherAlphabet[up - 'A'];</w:t>
+      </w:r>
+      <w:r>
+        <w:br/>
+      </w:r>
+      <w:r>
+        <w:rPr>
+          <w:rStyle w:val="VerbatimChar"/>
+        </w:rPr>
+        <w:t xml:space="preserve">        } else {</w:t>
+      </w:r>
+      <w:r>
+        <w:br/>
+      </w:r>
+      <w:r>
+        <w:rPr>
+          <w:rStyle w:val="VerbatimChar"/>
+        </w:rPr>
+        <w:t xml:space="preserve">            result += c;</w:t>
+      </w:r>
+      <w:r>
+        <w:br/>
+      </w:r>
+      <w:r>
+        <w:rPr>
+          <w:rStyle w:val="VerbatimChar"/>
+        </w:rPr>
+        <w:t xml:space="preserve">        }</w:t>
+      </w:r>
+      <w:r>
+        <w:br/>
+      </w:r>
+      <w:r>
+        <w:rPr>
+          <w:rStyle w:val="VerbatimChar"/>
+        </w:rPr>
+        <w:t xml:space="preserve">    }</w:t>
+      </w:r>
+      <w:r>
+        <w:br/>
+      </w:r>
+      <w:r>
+        <w:br/>
+      </w:r>
+      <w:r>
+        <w:rPr>
+          <w:rStyle w:val="VerbatimChar"/>
+        </w:rPr>
+        <w:t xml:space="preserve">    return result;</w:t>
+      </w:r>
+      <w:r>
+        <w:br/>
+      </w:r>
+      <w:r>
+        <w:rPr>
+          <w:rStyle w:val="VerbatimChar"/>
+        </w:rPr>
+        <w:t xml:space="preserve">}</w:t>
+      </w:r>
+      <w:r>
+        <w:br/>
+      </w:r>
+      <w:r>
+        <w:br/>
+      </w:r>
+      <w:r>
+        <w:rPr>
+          <w:rStyle w:val="VerbatimChar"/>
+        </w:rPr>
+        <w:t xml:space="preserve">// Розшифрування: зворотний пошук позиції літери в шифрувальному алфавіті</w:t>
+      </w:r>
+      <w:r>
+        <w:br/>
+      </w:r>
+      <w:r>
+        <w:rPr>
+          <w:rStyle w:val="VerbatimChar"/>
+        </w:rPr>
+        <w:t xml:space="preserve">std::string keywordDecrypt(const std::string&amp; text, const std::string&amp; keyword) {</w:t>
+      </w:r>
+      <w:r>
+        <w:br/>
+      </w:r>
+      <w:r>
+        <w:rPr>
+          <w:rStyle w:val="VerbatimChar"/>
+        </w:rPr>
+        <w:t xml:space="preserve">    std::string cipherAlphabet = createKeywordAlphabet(keyword);</w:t>
+      </w:r>
+      <w:r>
+        <w:br/>
+      </w:r>
+      <w:r>
+        <w:rPr>
+          <w:rStyle w:val="VerbatimChar"/>
+        </w:rPr>
+        <w:t xml:space="preserve">    std::string result;</w:t>
+      </w:r>
+      <w:r>
+        <w:br/>
+      </w:r>
+      <w:r>
+        <w:br/>
+      </w:r>
+      <w:r>
+        <w:rPr>
+          <w:rStyle w:val="VerbatimChar"/>
+        </w:rPr>
+        <w:t xml:space="preserve">    for (char c : text) {</w:t>
+      </w:r>
+      <w:r>
+        <w:br/>
+      </w:r>
+      <w:r>
+        <w:rPr>
+          <w:rStyle w:val="VerbatimChar"/>
+        </w:rPr>
+        <w:t xml:space="preserve">        char up = static_cast&lt;char&gt;(std::toupper(static_cast&lt;unsigned char&gt;(c)));</w:t>
+      </w:r>
+      <w:r>
+        <w:br/>
+      </w:r>
+      <w:r>
+        <w:rPr>
+          <w:rStyle w:val="VerbatimChar"/>
+        </w:rPr>
+        <w:t xml:space="preserve">        size_t pos = cipherAlphabet.find(up);</w:t>
+      </w:r>
+      <w:r>
+        <w:br/>
+      </w:r>
+      <w:r>
+        <w:rPr>
+          <w:rStyle w:val="VerbatimChar"/>
+        </w:rPr>
+        <w:t xml:space="preserve">        if (pos != std::string::npos) {</w:t>
+      </w:r>
+      <w:r>
+        <w:br/>
+      </w:r>
+      <w:r>
+        <w:rPr>
+          <w:rStyle w:val="VerbatimChar"/>
+        </w:rPr>
+        <w:t xml:space="preserve">            result += ALPHABET[pos];</w:t>
+      </w:r>
+      <w:r>
+        <w:br/>
+      </w:r>
+      <w:r>
+        <w:rPr>
+          <w:rStyle w:val="VerbatimChar"/>
+        </w:rPr>
+        <w:t xml:space="preserve">        } else {</w:t>
+      </w:r>
+      <w:r>
+        <w:br/>
+      </w:r>
+      <w:r>
+        <w:rPr>
+          <w:rStyle w:val="VerbatimChar"/>
+        </w:rPr>
+        <w:t xml:space="preserve">            result += c;</w:t>
+      </w:r>
+      <w:r>
+        <w:br/>
+      </w:r>
+      <w:r>
+        <w:rPr>
+          <w:rStyle w:val="VerbatimChar"/>
+        </w:rPr>
+        <w:t xml:space="preserve">        }</w:t>
+      </w:r>
+      <w:r>
+        <w:br/>
+      </w:r>
+      <w:r>
+        <w:rPr>
+          <w:rStyle w:val="VerbatimChar"/>
+        </w:rPr>
+        <w:t xml:space="preserve">    }</w:t>
+      </w:r>
+      <w:r>
+        <w:br/>
+      </w:r>
+      <w:r>
+        <w:br/>
+      </w:r>
+      <w:r>
+        <w:rPr>
+          <w:rStyle w:val="VerbatimChar"/>
+        </w:rPr>
+        <w:t xml:space="preserve">    return result;</w:t>
+      </w:r>
+      <w:r>
+        <w:br/>
+      </w:r>
+      <w:r>
+        <w:rPr>
+          <w:rStyle w:val="VerbatimChar"/>
+        </w:rPr>
+        <w:t xml:space="preserve">}</w:t>
+      </w:r>
+      <w:r>
+        <w:br/>
+      </w:r>
+      <w:r>
+        <w:br/>
+      </w:r>
+      <w:r>
+        <w:rPr>
+          <w:rStyle w:val="VerbatimChar"/>
+        </w:rPr>
+        <w:t xml:space="preserve">int main() {</w:t>
+      </w:r>
+      <w:r>
+        <w:br/>
+      </w:r>
+      <w:r>
+        <w:rPr>
+          <w:rStyle w:val="VerbatimChar"/>
+        </w:rPr>
+        <w:t xml:space="preserve">    std::string keyword = "CIPHER";</w:t>
+      </w:r>
+      <w:r>
+        <w:br/>
+      </w:r>
+      <w:r>
+        <w:rPr>
+          <w:rStyle w:val="VerbatimChar"/>
+        </w:rPr>
+        <w:t xml:space="preserve">    std::string plaintext = "HELLO WORLD";</w:t>
+      </w:r>
+      <w:r>
+        <w:br/>
+      </w:r>
+      <w:r>
+        <w:br/>
+      </w:r>
+      <w:r>
+        <w:rPr>
+          <w:rStyle w:val="VerbatimChar"/>
+        </w:rPr>
+        <w:t xml:space="preserve">    std::cout &lt;&lt; "Ключове слово:    " &lt;&lt; keyword &lt;&lt; "\n";</w:t>
+      </w:r>
+      <w:r>
+        <w:br/>
+      </w:r>
+      <w:r>
+        <w:rPr>
+          <w:rStyle w:val="VerbatimChar"/>
+        </w:rPr>
+        <w:t xml:space="preserve">    std::cout &lt;&lt; "Алфавіт:          " &lt;&lt; createKeywordAlphabet(keyword) &lt;&lt; "\n";</w:t>
+      </w:r>
+      <w:r>
+        <w:br/>
+      </w:r>
+      <w:r>
+        <w:rPr>
+          <w:rStyle w:val="VerbatimChar"/>
+        </w:rPr>
+        <w:t xml:space="preserve">    std::cout &lt;&lt; "Відкритий текст:  " &lt;&lt; plaintext &lt;&lt; "\n";</w:t>
+      </w:r>
+      <w:r>
+        <w:br/>
+      </w:r>
+      <w:r>
+        <w:br/>
+      </w:r>
+      <w:r>
+        <w:rPr>
+          <w:rStyle w:val="VerbatimChar"/>
+        </w:rPr>
+        <w:t xml:space="preserve">    std::string ciphertext = keywordEncrypt(plaintext, keyword);</w:t>
+      </w:r>
+      <w:r>
+        <w:br/>
+      </w:r>
+      <w:r>
+        <w:rPr>
+          <w:rStyle w:val="VerbatimChar"/>
+        </w:rPr>
+        <w:t xml:space="preserve">    std::cout &lt;&lt; "Шифротекст:       " &lt;&lt; ciphertext &lt;&lt; "\n";</w:t>
+      </w:r>
+      <w:r>
+        <w:br/>
+      </w:r>
+      <w:r>
+        <w:rPr>
+          <w:rStyle w:val="VerbatimChar"/>
+        </w:rPr>
+        <w:t xml:space="preserve">    std::cout &lt;&lt; "Розшифровано:     " &lt;&lt; keywordDecrypt(ciphertext, keyword) &lt;&lt; "\n";</w:t>
+      </w:r>
+      <w:r>
+        <w:br/>
+      </w:r>
+      <w:r>
+        <w:br/>
+      </w:r>
+      <w:r>
+        <w:rPr>
+          <w:rStyle w:val="VerbatimChar"/>
+        </w:rPr>
+        <w:t xml:space="preserve">    return 0;</w:t>
+      </w:r>
+      <w:r>
+        <w:br/>
+      </w:r>
+      <w:r>
+        <w:rPr>
+          <w:rStyle w:val="VerbatimChar"/>
+        </w:rPr>
+        <w:t xml:space="preserve">}</w:t>
+      </w:r>
+    </w:p>
+    <w:p>
+      <w:pPr>
+        <w:pStyle w:val="FirstParagraph"/>
+      </w:pPr>
+      <w:r>
+        <w:t xml:space="preserve">Результат роботи програми:</w:t>
+      </w:r>
+    </w:p>
+    <w:p>
+      <w:pPr>
+        <w:pStyle w:val="SourceCode"/>
+      </w:pPr>
+      <w:r>
+        <w:rPr>
+          <w:rStyle w:val="VerbatimChar"/>
+        </w:rPr>
+        <w:t xml:space="preserve">Ключове слово:    CIPHER</w:t>
+      </w:r>
+      <w:r>
+        <w:br/>
+      </w:r>
+      <w:r>
+        <w:rPr>
+          <w:rStyle w:val="VerbatimChar"/>
+        </w:rPr>
+        <w:t xml:space="preserve">Алфавіт:          CIPHERABDFGJKLMNOQSTUVWXYZ</w:t>
+      </w:r>
+      <w:r>
+        <w:br/>
+      </w:r>
+      <w:r>
+        <w:rPr>
+          <w:rStyle w:val="VerbatimChar"/>
+        </w:rPr>
+        <w:t xml:space="preserve">Відкритий текст:  HELLO WORLD</w:t>
+      </w:r>
+      <w:r>
+        <w:br/>
+      </w:r>
+      <w:r>
+        <w:rPr>
+          <w:rStyle w:val="VerbatimChar"/>
+        </w:rPr>
+        <w:t xml:space="preserve">Шифротекст:       BEJJM WMQJH</w:t>
+      </w:r>
+      <w:r>
+        <w:br/>
+      </w:r>
+      <w:r>
+        <w:rPr>
+          <w:rStyle w:val="VerbatimChar"/>
+        </w:rPr>
+        <w:t xml:space="preserve">Розшифровано:     HELLO WORLD</w:t>
       </w:r>
     </w:p>
     <w:bookmarkEnd w:id="13"/>
@@ -997,538 +1187,700 @@
         <w:rPr>
           <w:rStyle w:val="VerbatimChar"/>
         </w:rPr>
-        <w:t xml:space="preserve">def gcd(a: int, b: int) -&gt; int:</w:t>
-      </w:r>
-      <w:r>
-        <w:br/>
-      </w:r>
-      <w:r>
-        <w:rPr>
-          <w:rStyle w:val="VerbatimChar"/>
-        </w:rPr>
-        <w:t xml:space="preserve">    """НСД (алгоритм Евкліда)."""</w:t>
-      </w:r>
-      <w:r>
-        <w:br/>
-      </w:r>
-      <w:r>
-        <w:rPr>
-          <w:rStyle w:val="VerbatimChar"/>
-        </w:rPr>
-        <w:t xml:space="preserve">    while b:</w:t>
-      </w:r>
-      <w:r>
-        <w:br/>
-      </w:r>
-      <w:r>
-        <w:rPr>
-          <w:rStyle w:val="VerbatimChar"/>
-        </w:rPr>
-        <w:t xml:space="preserve">        a, b = b, a % b</w:t>
-      </w:r>
-      <w:r>
-        <w:br/>
-      </w:r>
-      <w:r>
-        <w:rPr>
-          <w:rStyle w:val="VerbatimChar"/>
-        </w:rPr>
-        <w:t xml:space="preserve">    return a</w:t>
-      </w:r>
-      <w:r>
-        <w:br/>
-      </w:r>
-      <w:r>
-        <w:br/>
-      </w:r>
-      <w:r>
-        <w:rPr>
-          <w:rStyle w:val="VerbatimChar"/>
-        </w:rPr>
-        <w:t xml:space="preserve">def mod_inverse(a: int, n: int) -&gt; int:</w:t>
-      </w:r>
-      <w:r>
-        <w:br/>
-      </w:r>
-      <w:r>
-        <w:rPr>
-          <w:rStyle w:val="VerbatimChar"/>
-        </w:rPr>
-        <w:t xml:space="preserve">    """Обернений елемент a⁻¹ mod n."""</w:t>
-      </w:r>
-      <w:r>
-        <w:br/>
-      </w:r>
-      <w:r>
-        <w:rPr>
-          <w:rStyle w:val="VerbatimChar"/>
-        </w:rPr>
-        <w:t xml:space="preserve">    # Розширений алгоритм Евкліда</w:t>
-      </w:r>
-      <w:r>
-        <w:br/>
-      </w:r>
-      <w:r>
-        <w:rPr>
-          <w:rStyle w:val="VerbatimChar"/>
-        </w:rPr>
-        <w:t xml:space="preserve">    old_r, r = a, n</w:t>
-      </w:r>
-      <w:r>
-        <w:br/>
-      </w:r>
-      <w:r>
-        <w:rPr>
-          <w:rStyle w:val="VerbatimChar"/>
-        </w:rPr>
-        <w:t xml:space="preserve">    old_s, s = 1, 0</w:t>
-      </w:r>
-      <w:r>
-        <w:br/>
-      </w:r>
-      <w:r>
-        <w:br/>
-      </w:r>
-      <w:r>
-        <w:rPr>
-          <w:rStyle w:val="VerbatimChar"/>
-        </w:rPr>
-        <w:t xml:space="preserve">    while r != 0:</w:t>
-      </w:r>
-      <w:r>
-        <w:br/>
-      </w:r>
-      <w:r>
-        <w:rPr>
-          <w:rStyle w:val="VerbatimChar"/>
-        </w:rPr>
-        <w:t xml:space="preserve">        q = old_r // r</w:t>
-      </w:r>
-      <w:r>
-        <w:br/>
-      </w:r>
-      <w:r>
-        <w:rPr>
-          <w:rStyle w:val="VerbatimChar"/>
-        </w:rPr>
-        <w:t xml:space="preserve">        old_r, r = r, old_r - q * r</w:t>
-      </w:r>
-      <w:r>
-        <w:br/>
-      </w:r>
-      <w:r>
-        <w:rPr>
-          <w:rStyle w:val="VerbatimChar"/>
-        </w:rPr>
-        <w:t xml:space="preserve">        old_s, s = s, old_s - q * s</w:t>
-      </w:r>
-      <w:r>
-        <w:br/>
-      </w:r>
-      <w:r>
-        <w:br/>
-      </w:r>
-      <w:r>
-        <w:rPr>
-          <w:rStyle w:val="VerbatimChar"/>
-        </w:rPr>
-        <w:t xml:space="preserve">    if old_r != 1:</w:t>
-      </w:r>
-      <w:r>
-        <w:br/>
-      </w:r>
-      <w:r>
-        <w:rPr>
-          <w:rStyle w:val="VerbatimChar"/>
-        </w:rPr>
-        <w:t xml:space="preserve">        raise ValueError(f"Обернений не існує: gcd({a}, {n}) = {old_r}")</w:t>
-      </w:r>
-      <w:r>
-        <w:br/>
-      </w:r>
-      <w:r>
-        <w:br/>
-      </w:r>
-      <w:r>
-        <w:rPr>
-          <w:rStyle w:val="VerbatimChar"/>
-        </w:rPr>
-        <w:t xml:space="preserve">    return old_s % n</w:t>
-      </w:r>
-      <w:r>
-        <w:br/>
-      </w:r>
-      <w:r>
-        <w:br/>
-      </w:r>
-      <w:r>
-        <w:rPr>
-          <w:rStyle w:val="VerbatimChar"/>
-        </w:rPr>
-        <w:t xml:space="preserve">def affine_encrypt(plaintext: str, a: int, b: int) -&gt; str:</w:t>
-      </w:r>
-      <w:r>
-        <w:br/>
-      </w:r>
-      <w:r>
-        <w:rPr>
-          <w:rStyle w:val="VerbatimChar"/>
-        </w:rPr>
-        <w:t xml:space="preserve">    """Шифрування афінним шифром: C = (a·P + b) mod 26."""</w:t>
-      </w:r>
-      <w:r>
-        <w:br/>
-      </w:r>
-      <w:r>
-        <w:rPr>
-          <w:rStyle w:val="VerbatimChar"/>
-        </w:rPr>
-        <w:t xml:space="preserve">    n = 26</w:t>
-      </w:r>
-      <w:r>
-        <w:br/>
-      </w:r>
-      <w:r>
-        <w:rPr>
-          <w:rStyle w:val="VerbatimChar"/>
-        </w:rPr>
-        <w:t xml:space="preserve">    if gcd(a, n) != 1:</w:t>
-      </w:r>
-      <w:r>
-        <w:br/>
-      </w:r>
-      <w:r>
-        <w:rPr>
-          <w:rStyle w:val="VerbatimChar"/>
-        </w:rPr>
-        <w:t xml:space="preserve">        raise ValueError(f"a={a} не взаємно просте з {n}")</w:t>
-      </w:r>
-      <w:r>
-        <w:br/>
-      </w:r>
-      <w:r>
-        <w:br/>
-      </w:r>
-      <w:r>
-        <w:rPr>
-          <w:rStyle w:val="VerbatimChar"/>
-        </w:rPr>
-        <w:t xml:space="preserve">    result = []</w:t>
-      </w:r>
-      <w:r>
-        <w:br/>
-      </w:r>
-      <w:r>
-        <w:rPr>
-          <w:rStyle w:val="VerbatimChar"/>
-        </w:rPr>
-        <w:t xml:space="preserve">    for c in plaintext.upper():</w:t>
-      </w:r>
-      <w:r>
-        <w:br/>
-      </w:r>
-      <w:r>
-        <w:rPr>
-          <w:rStyle w:val="VerbatimChar"/>
-        </w:rPr>
-        <w:t xml:space="preserve">        if c.isalpha():</w:t>
-      </w:r>
-      <w:r>
-        <w:br/>
-      </w:r>
-      <w:r>
-        <w:rPr>
-          <w:rStyle w:val="VerbatimChar"/>
-        </w:rPr>
-        <w:t xml:space="preserve">            p = ord(c) - ord('A')</w:t>
-      </w:r>
-      <w:r>
-        <w:br/>
-      </w:r>
-      <w:r>
-        <w:rPr>
-          <w:rStyle w:val="VerbatimChar"/>
-        </w:rPr>
-        <w:t xml:space="preserve">            cipher = (a * p + b) % n</w:t>
-      </w:r>
-      <w:r>
-        <w:br/>
-      </w:r>
-      <w:r>
-        <w:rPr>
-          <w:rStyle w:val="VerbatimChar"/>
-        </w:rPr>
-        <w:t xml:space="preserve">            result.append(chr(cipher + ord('A')))</w:t>
-      </w:r>
-      <w:r>
-        <w:br/>
-      </w:r>
-      <w:r>
-        <w:rPr>
-          <w:rStyle w:val="VerbatimChar"/>
-        </w:rPr>
-        <w:t xml:space="preserve">        else:</w:t>
-      </w:r>
-      <w:r>
-        <w:br/>
-      </w:r>
-      <w:r>
-        <w:rPr>
-          <w:rStyle w:val="VerbatimChar"/>
-        </w:rPr>
-        <w:t xml:space="preserve">            result.append(c)</w:t>
-      </w:r>
-      <w:r>
-        <w:br/>
-      </w:r>
-      <w:r>
-        <w:br/>
-      </w:r>
-      <w:r>
-        <w:rPr>
-          <w:rStyle w:val="VerbatimChar"/>
-        </w:rPr>
-        <w:t xml:space="preserve">    return ''.join(result)</w:t>
-      </w:r>
-      <w:r>
-        <w:br/>
-      </w:r>
-      <w:r>
-        <w:br/>
-      </w:r>
-      <w:r>
-        <w:rPr>
-          <w:rStyle w:val="VerbatimChar"/>
-        </w:rPr>
-        <w:t xml:space="preserve">def affine_decrypt(ciphertext: str, a: int, b: int) -&gt; str:</w:t>
-      </w:r>
-      <w:r>
-        <w:br/>
-      </w:r>
-      <w:r>
-        <w:rPr>
-          <w:rStyle w:val="VerbatimChar"/>
-        </w:rPr>
-        <w:t xml:space="preserve">    """Дешифрування: P = a⁻¹·(C - b) mod 26."""</w:t>
-      </w:r>
-      <w:r>
-        <w:br/>
-      </w:r>
-      <w:r>
-        <w:rPr>
-          <w:rStyle w:val="VerbatimChar"/>
-        </w:rPr>
-        <w:t xml:space="preserve">    n = 26</w:t>
-      </w:r>
-      <w:r>
-        <w:br/>
-      </w:r>
-      <w:r>
-        <w:rPr>
-          <w:rStyle w:val="VerbatimChar"/>
-        </w:rPr>
-        <w:t xml:space="preserve">    a_inv = mod_inverse(a, n)</w:t>
-      </w:r>
-      <w:r>
-        <w:br/>
-      </w:r>
-      <w:r>
-        <w:br/>
-      </w:r>
-      <w:r>
-        <w:rPr>
-          <w:rStyle w:val="VerbatimChar"/>
-        </w:rPr>
-        <w:t xml:space="preserve">    result = []</w:t>
-      </w:r>
-      <w:r>
-        <w:br/>
-      </w:r>
-      <w:r>
-        <w:rPr>
-          <w:rStyle w:val="VerbatimChar"/>
-        </w:rPr>
-        <w:t xml:space="preserve">    for c in ciphertext.upper():</w:t>
-      </w:r>
-      <w:r>
-        <w:br/>
-      </w:r>
-      <w:r>
-        <w:rPr>
-          <w:rStyle w:val="VerbatimChar"/>
-        </w:rPr>
-        <w:t xml:space="preserve">        if c.isalpha():</w:t>
-      </w:r>
-      <w:r>
-        <w:br/>
-      </w:r>
-      <w:r>
-        <w:rPr>
-          <w:rStyle w:val="VerbatimChar"/>
-        </w:rPr>
-        <w:t xml:space="preserve">            cipher = ord(c) - ord('A')</w:t>
-      </w:r>
-      <w:r>
-        <w:br/>
-      </w:r>
-      <w:r>
-        <w:rPr>
-          <w:rStyle w:val="VerbatimChar"/>
-        </w:rPr>
-        <w:t xml:space="preserve">            p = (a_inv * (cipher - b)) % n</w:t>
-      </w:r>
-      <w:r>
-        <w:br/>
-      </w:r>
-      <w:r>
-        <w:rPr>
-          <w:rStyle w:val="VerbatimChar"/>
-        </w:rPr>
-        <w:t xml:space="preserve">            result.append(chr(p + ord('A')))</w:t>
-      </w:r>
-      <w:r>
-        <w:br/>
-      </w:r>
-      <w:r>
-        <w:rPr>
-          <w:rStyle w:val="VerbatimChar"/>
-        </w:rPr>
-        <w:t xml:space="preserve">        else:</w:t>
-      </w:r>
-      <w:r>
-        <w:br/>
-      </w:r>
-      <w:r>
-        <w:rPr>
-          <w:rStyle w:val="VerbatimChar"/>
-        </w:rPr>
-        <w:t xml:space="preserve">            result.append(c)</w:t>
-      </w:r>
-      <w:r>
-        <w:br/>
-      </w:r>
-      <w:r>
-        <w:br/>
-      </w:r>
-      <w:r>
-        <w:rPr>
-          <w:rStyle w:val="VerbatimChar"/>
-        </w:rPr>
-        <w:t xml:space="preserve">    return ''.join(result)</w:t>
-      </w:r>
-      <w:r>
-        <w:br/>
-      </w:r>
-      <w:r>
-        <w:br/>
-      </w:r>
-      <w:r>
-        <w:rPr>
-          <w:rStyle w:val="VerbatimChar"/>
-        </w:rPr>
-        <w:t xml:space="preserve"># Демонстрація</w:t>
-      </w:r>
-      <w:r>
-        <w:br/>
-      </w:r>
-      <w:r>
-        <w:rPr>
-          <w:rStyle w:val="VerbatimChar"/>
-        </w:rPr>
-        <w:t xml:space="preserve">a, b = 5, 8</w:t>
-      </w:r>
-      <w:r>
-        <w:br/>
-      </w:r>
-      <w:r>
-        <w:rPr>
-          <w:rStyle w:val="VerbatimChar"/>
-        </w:rPr>
-        <w:t xml:space="preserve">plaintext = "AFFINE CIPHER"</w:t>
-      </w:r>
-      <w:r>
-        <w:br/>
-      </w:r>
-      <w:r>
-        <w:br/>
-      </w:r>
-      <w:r>
-        <w:rPr>
-          <w:rStyle w:val="VerbatimChar"/>
-        </w:rPr>
-        <w:t xml:space="preserve">print(f"\nАфінний шифр: a={a}, b={b}")</w:t>
-      </w:r>
-      <w:r>
-        <w:br/>
-      </w:r>
-      <w:r>
-        <w:rPr>
-          <w:rStyle w:val="VerbatimChar"/>
-        </w:rPr>
-        <w:t xml:space="preserve">print(f"Перевірка: gcd({a}, 26) = {gcd(a, 26)}")</w:t>
-      </w:r>
-      <w:r>
-        <w:br/>
-      </w:r>
-      <w:r>
-        <w:rPr>
-          <w:rStyle w:val="VerbatimChar"/>
-        </w:rPr>
-        <w:t xml:space="preserve">print(f"Обернений: {a}⁻¹ mod 26 = {mod_inverse(a, 26)}")</w:t>
-      </w:r>
-      <w:r>
-        <w:br/>
-      </w:r>
-      <w:r>
-        <w:br/>
-      </w:r>
-      <w:r>
-        <w:rPr>
-          <w:rStyle w:val="VerbatimChar"/>
-        </w:rPr>
-        <w:t xml:space="preserve">print(f"\nВідкритий текст: {plaintext}")</w:t>
-      </w:r>
-      <w:r>
-        <w:br/>
-      </w:r>
-      <w:r>
-        <w:br/>
-      </w:r>
-      <w:r>
-        <w:rPr>
-          <w:rStyle w:val="VerbatimChar"/>
-        </w:rPr>
-        <w:t xml:space="preserve">ciphertext = affine_encrypt(plaintext, a, b)</w:t>
-      </w:r>
-      <w:r>
-        <w:br/>
-      </w:r>
-      <w:r>
-        <w:rPr>
-          <w:rStyle w:val="VerbatimChar"/>
-        </w:rPr>
-        <w:t xml:space="preserve">print(f"Шифротекст: {ciphertext}")</w:t>
-      </w:r>
-      <w:r>
-        <w:br/>
-      </w:r>
-      <w:r>
-        <w:br/>
-      </w:r>
-      <w:r>
-        <w:rPr>
-          <w:rStyle w:val="VerbatimChar"/>
-        </w:rPr>
-        <w:t xml:space="preserve">decrypted = affine_decrypt(ciphertext, a, b)</w:t>
-      </w:r>
-      <w:r>
-        <w:br/>
-      </w:r>
-      <w:r>
-        <w:rPr>
-          <w:rStyle w:val="VerbatimChar"/>
-        </w:rPr>
-        <w:t xml:space="preserve">print(f"Розшифровано: {decrypted}")</w:t>
+        <w:t xml:space="preserve">#include &lt;iostream&gt;</w:t>
+      </w:r>
+      <w:r>
+        <w:br/>
+      </w:r>
+      <w:r>
+        <w:rPr>
+          <w:rStyle w:val="VerbatimChar"/>
+        </w:rPr>
+        <w:t xml:space="preserve">#include &lt;string&gt;</w:t>
+      </w:r>
+      <w:r>
+        <w:br/>
+      </w:r>
+      <w:r>
+        <w:rPr>
+          <w:rStyle w:val="VerbatimChar"/>
+        </w:rPr>
+        <w:t xml:space="preserve">#include &lt;stdexcept&gt;</w:t>
+      </w:r>
+      <w:r>
+        <w:br/>
+      </w:r>
+      <w:r>
+        <w:rPr>
+          <w:rStyle w:val="VerbatimChar"/>
+        </w:rPr>
+        <w:t xml:space="preserve">#include &lt;cctype&gt;</w:t>
+      </w:r>
+      <w:r>
+        <w:br/>
+      </w:r>
+      <w:r>
+        <w:br/>
+      </w:r>
+      <w:r>
+        <w:rPr>
+          <w:rStyle w:val="VerbatimChar"/>
+        </w:rPr>
+        <w:t xml:space="preserve">const int N = 26;  // потужність англійської абетки</w:t>
+      </w:r>
+      <w:r>
+        <w:br/>
+      </w:r>
+      <w:r>
+        <w:br/>
+      </w:r>
+      <w:r>
+        <w:rPr>
+          <w:rStyle w:val="VerbatimChar"/>
+        </w:rPr>
+        <w:t xml:space="preserve">// Найбільший спільний дільник, алгоритм Евкліда</w:t>
+      </w:r>
+      <w:r>
+        <w:br/>
+      </w:r>
+      <w:r>
+        <w:rPr>
+          <w:rStyle w:val="VerbatimChar"/>
+        </w:rPr>
+        <w:t xml:space="preserve">int gcd(int a, int b) {</w:t>
+      </w:r>
+      <w:r>
+        <w:br/>
+      </w:r>
+      <w:r>
+        <w:rPr>
+          <w:rStyle w:val="VerbatimChar"/>
+        </w:rPr>
+        <w:t xml:space="preserve">    while (b != 0) {</w:t>
+      </w:r>
+      <w:r>
+        <w:br/>
+      </w:r>
+      <w:r>
+        <w:rPr>
+          <w:rStyle w:val="VerbatimChar"/>
+        </w:rPr>
+        <w:t xml:space="preserve">        int t = a % b;</w:t>
+      </w:r>
+      <w:r>
+        <w:br/>
+      </w:r>
+      <w:r>
+        <w:rPr>
+          <w:rStyle w:val="VerbatimChar"/>
+        </w:rPr>
+        <w:t xml:space="preserve">        a = b;</w:t>
+      </w:r>
+      <w:r>
+        <w:br/>
+      </w:r>
+      <w:r>
+        <w:rPr>
+          <w:rStyle w:val="VerbatimChar"/>
+        </w:rPr>
+        <w:t xml:space="preserve">        b = t;</w:t>
+      </w:r>
+      <w:r>
+        <w:br/>
+      </w:r>
+      <w:r>
+        <w:rPr>
+          <w:rStyle w:val="VerbatimChar"/>
+        </w:rPr>
+        <w:t xml:space="preserve">    }</w:t>
+      </w:r>
+      <w:r>
+        <w:br/>
+      </w:r>
+      <w:r>
+        <w:rPr>
+          <w:rStyle w:val="VerbatimChar"/>
+        </w:rPr>
+        <w:t xml:space="preserve">    return a;</w:t>
+      </w:r>
+      <w:r>
+        <w:br/>
+      </w:r>
+      <w:r>
+        <w:rPr>
+          <w:rStyle w:val="VerbatimChar"/>
+        </w:rPr>
+        <w:t xml:space="preserve">}</w:t>
+      </w:r>
+      <w:r>
+        <w:br/>
+      </w:r>
+      <w:r>
+        <w:br/>
+      </w:r>
+      <w:r>
+        <w:rPr>
+          <w:rStyle w:val="VerbatimChar"/>
+        </w:rPr>
+        <w:t xml:space="preserve">// Обернений елемент a^-1 mod n, розширений алгоритм Евкліда</w:t>
+      </w:r>
+      <w:r>
+        <w:br/>
+      </w:r>
+      <w:r>
+        <w:rPr>
+          <w:rStyle w:val="VerbatimChar"/>
+        </w:rPr>
+        <w:t xml:space="preserve">int modInverse(int a, int n) {</w:t>
+      </w:r>
+      <w:r>
+        <w:br/>
+      </w:r>
+      <w:r>
+        <w:rPr>
+          <w:rStyle w:val="VerbatimChar"/>
+        </w:rPr>
+        <w:t xml:space="preserve">    int oldR = a, r = n;</w:t>
+      </w:r>
+      <w:r>
+        <w:br/>
+      </w:r>
+      <w:r>
+        <w:rPr>
+          <w:rStyle w:val="VerbatimChar"/>
+        </w:rPr>
+        <w:t xml:space="preserve">    int oldS = 1, s = 0;</w:t>
+      </w:r>
+      <w:r>
+        <w:br/>
+      </w:r>
+      <w:r>
+        <w:br/>
+      </w:r>
+      <w:r>
+        <w:rPr>
+          <w:rStyle w:val="VerbatimChar"/>
+        </w:rPr>
+        <w:t xml:space="preserve">    while (r != 0) {</w:t>
+      </w:r>
+      <w:r>
+        <w:br/>
+      </w:r>
+      <w:r>
+        <w:rPr>
+          <w:rStyle w:val="VerbatimChar"/>
+        </w:rPr>
+        <w:t xml:space="preserve">        int q = oldR / r;</w:t>
+      </w:r>
+      <w:r>
+        <w:br/>
+      </w:r>
+      <w:r>
+        <w:rPr>
+          <w:rStyle w:val="VerbatimChar"/>
+        </w:rPr>
+        <w:t xml:space="preserve">        int tmp = oldR - q * r;  oldR = r;  r = tmp;</w:t>
+      </w:r>
+      <w:r>
+        <w:br/>
+      </w:r>
+      <w:r>
+        <w:rPr>
+          <w:rStyle w:val="VerbatimChar"/>
+        </w:rPr>
+        <w:t xml:space="preserve">        tmp = oldS - q * s;      oldS = s;  s = tmp;</w:t>
+      </w:r>
+      <w:r>
+        <w:br/>
+      </w:r>
+      <w:r>
+        <w:rPr>
+          <w:rStyle w:val="VerbatimChar"/>
+        </w:rPr>
+        <w:t xml:space="preserve">    }</w:t>
+      </w:r>
+      <w:r>
+        <w:br/>
+      </w:r>
+      <w:r>
+        <w:br/>
+      </w:r>
+      <w:r>
+        <w:rPr>
+          <w:rStyle w:val="VerbatimChar"/>
+        </w:rPr>
+        <w:t xml:space="preserve">    if (oldR != 1) {</w:t>
+      </w:r>
+      <w:r>
+        <w:br/>
+      </w:r>
+      <w:r>
+        <w:rPr>
+          <w:rStyle w:val="VerbatimChar"/>
+        </w:rPr>
+        <w:t xml:space="preserve">        throw std::runtime_error("Оберненого елемента не існує: gcd != 1");</w:t>
+      </w:r>
+      <w:r>
+        <w:br/>
+      </w:r>
+      <w:r>
+        <w:rPr>
+          <w:rStyle w:val="VerbatimChar"/>
+        </w:rPr>
+        <w:t xml:space="preserve">    }</w:t>
+      </w:r>
+      <w:r>
+        <w:br/>
+      </w:r>
+      <w:r>
+        <w:br/>
+      </w:r>
+      <w:r>
+        <w:rPr>
+          <w:rStyle w:val="VerbatimChar"/>
+        </w:rPr>
+        <w:t xml:space="preserve">    return ((oldS % n) + n) % n;  // нормалізація до діапазону [0, n)</w:t>
+      </w:r>
+      <w:r>
+        <w:br/>
+      </w:r>
+      <w:r>
+        <w:rPr>
+          <w:rStyle w:val="VerbatimChar"/>
+        </w:rPr>
+        <w:t xml:space="preserve">}</w:t>
+      </w:r>
+      <w:r>
+        <w:br/>
+      </w:r>
+      <w:r>
+        <w:br/>
+      </w:r>
+      <w:r>
+        <w:rPr>
+          <w:rStyle w:val="VerbatimChar"/>
+        </w:rPr>
+        <w:t xml:space="preserve">// Зашифрування: C = (a*P + b) mod N</w:t>
+      </w:r>
+      <w:r>
+        <w:br/>
+      </w:r>
+      <w:r>
+        <w:rPr>
+          <w:rStyle w:val="VerbatimChar"/>
+        </w:rPr>
+        <w:t xml:space="preserve">std::string affineEncrypt(const std::string&amp; text, int a, int b) {</w:t>
+      </w:r>
+      <w:r>
+        <w:br/>
+      </w:r>
+      <w:r>
+        <w:rPr>
+          <w:rStyle w:val="VerbatimChar"/>
+        </w:rPr>
+        <w:t xml:space="preserve">    if (gcd(a, N) != 1) {</w:t>
+      </w:r>
+      <w:r>
+        <w:br/>
+      </w:r>
+      <w:r>
+        <w:rPr>
+          <w:rStyle w:val="VerbatimChar"/>
+        </w:rPr>
+        <w:t xml:space="preserve">        throw std::runtime_error("Параметр a не взаємно простий з N");</w:t>
+      </w:r>
+      <w:r>
+        <w:br/>
+      </w:r>
+      <w:r>
+        <w:rPr>
+          <w:rStyle w:val="VerbatimChar"/>
+        </w:rPr>
+        <w:t xml:space="preserve">    }</w:t>
+      </w:r>
+      <w:r>
+        <w:br/>
+      </w:r>
+      <w:r>
+        <w:br/>
+      </w:r>
+      <w:r>
+        <w:rPr>
+          <w:rStyle w:val="VerbatimChar"/>
+        </w:rPr>
+        <w:t xml:space="preserve">    std::string result;</w:t>
+      </w:r>
+      <w:r>
+        <w:br/>
+      </w:r>
+      <w:r>
+        <w:rPr>
+          <w:rStyle w:val="VerbatimChar"/>
+        </w:rPr>
+        <w:t xml:space="preserve">    for (char c : text) {</w:t>
+      </w:r>
+      <w:r>
+        <w:br/>
+      </w:r>
+      <w:r>
+        <w:rPr>
+          <w:rStyle w:val="VerbatimChar"/>
+        </w:rPr>
+        <w:t xml:space="preserve">        char up = static_cast&lt;char&gt;(std::toupper(static_cast&lt;unsigned char&gt;(c)));</w:t>
+      </w:r>
+      <w:r>
+        <w:br/>
+      </w:r>
+      <w:r>
+        <w:rPr>
+          <w:rStyle w:val="VerbatimChar"/>
+        </w:rPr>
+        <w:t xml:space="preserve">        if (up &gt;= 'A' &amp;&amp; up &lt;= 'Z') {</w:t>
+      </w:r>
+      <w:r>
+        <w:br/>
+      </w:r>
+      <w:r>
+        <w:rPr>
+          <w:rStyle w:val="VerbatimChar"/>
+        </w:rPr>
+        <w:t xml:space="preserve">            int p = up - 'A';</w:t>
+      </w:r>
+      <w:r>
+        <w:br/>
+      </w:r>
+      <w:r>
+        <w:rPr>
+          <w:rStyle w:val="VerbatimChar"/>
+        </w:rPr>
+        <w:t xml:space="preserve">            result += static_cast&lt;char&gt;((a * p + b) % N + 'A');</w:t>
+      </w:r>
+      <w:r>
+        <w:br/>
+      </w:r>
+      <w:r>
+        <w:rPr>
+          <w:rStyle w:val="VerbatimChar"/>
+        </w:rPr>
+        <w:t xml:space="preserve">        } else {</w:t>
+      </w:r>
+      <w:r>
+        <w:br/>
+      </w:r>
+      <w:r>
+        <w:rPr>
+          <w:rStyle w:val="VerbatimChar"/>
+        </w:rPr>
+        <w:t xml:space="preserve">            result += c;</w:t>
+      </w:r>
+      <w:r>
+        <w:br/>
+      </w:r>
+      <w:r>
+        <w:rPr>
+          <w:rStyle w:val="VerbatimChar"/>
+        </w:rPr>
+        <w:t xml:space="preserve">        }</w:t>
+      </w:r>
+      <w:r>
+        <w:br/>
+      </w:r>
+      <w:r>
+        <w:rPr>
+          <w:rStyle w:val="VerbatimChar"/>
+        </w:rPr>
+        <w:t xml:space="preserve">    }</w:t>
+      </w:r>
+      <w:r>
+        <w:br/>
+      </w:r>
+      <w:r>
+        <w:rPr>
+          <w:rStyle w:val="VerbatimChar"/>
+        </w:rPr>
+        <w:t xml:space="preserve">    return result;</w:t>
+      </w:r>
+      <w:r>
+        <w:br/>
+      </w:r>
+      <w:r>
+        <w:rPr>
+          <w:rStyle w:val="VerbatimChar"/>
+        </w:rPr>
+        <w:t xml:space="preserve">}</w:t>
+      </w:r>
+      <w:r>
+        <w:br/>
+      </w:r>
+      <w:r>
+        <w:br/>
+      </w:r>
+      <w:r>
+        <w:rPr>
+          <w:rStyle w:val="VerbatimChar"/>
+        </w:rPr>
+        <w:t xml:space="preserve">// Розшифрування: P = a^-1 * (C - b) mod N</w:t>
+      </w:r>
+      <w:r>
+        <w:br/>
+      </w:r>
+      <w:r>
+        <w:rPr>
+          <w:rStyle w:val="VerbatimChar"/>
+        </w:rPr>
+        <w:t xml:space="preserve">std::string affineDecrypt(const std::string&amp; text, int a, int b) {</w:t>
+      </w:r>
+      <w:r>
+        <w:br/>
+      </w:r>
+      <w:r>
+        <w:rPr>
+          <w:rStyle w:val="VerbatimChar"/>
+        </w:rPr>
+        <w:t xml:space="preserve">    int aInv = modInverse(a, N);</w:t>
+      </w:r>
+      <w:r>
+        <w:br/>
+      </w:r>
+      <w:r>
+        <w:br/>
+      </w:r>
+      <w:r>
+        <w:rPr>
+          <w:rStyle w:val="VerbatimChar"/>
+        </w:rPr>
+        <w:t xml:space="preserve">    std::string result;</w:t>
+      </w:r>
+      <w:r>
+        <w:br/>
+      </w:r>
+      <w:r>
+        <w:rPr>
+          <w:rStyle w:val="VerbatimChar"/>
+        </w:rPr>
+        <w:t xml:space="preserve">    for (char c : text) {</w:t>
+      </w:r>
+      <w:r>
+        <w:br/>
+      </w:r>
+      <w:r>
+        <w:rPr>
+          <w:rStyle w:val="VerbatimChar"/>
+        </w:rPr>
+        <w:t xml:space="preserve">        char up = static_cast&lt;char&gt;(std::toupper(static_cast&lt;unsigned char&gt;(c)));</w:t>
+      </w:r>
+      <w:r>
+        <w:br/>
+      </w:r>
+      <w:r>
+        <w:rPr>
+          <w:rStyle w:val="VerbatimChar"/>
+        </w:rPr>
+        <w:t xml:space="preserve">        if (up &gt;= 'A' &amp;&amp; up &lt;= 'Z') {</w:t>
+      </w:r>
+      <w:r>
+        <w:br/>
+      </w:r>
+      <w:r>
+        <w:rPr>
+          <w:rStyle w:val="VerbatimChar"/>
+        </w:rPr>
+        <w:t xml:space="preserve">            int cipher = up - 'A';</w:t>
+      </w:r>
+      <w:r>
+        <w:br/>
+      </w:r>
+      <w:r>
+        <w:rPr>
+          <w:rStyle w:val="VerbatimChar"/>
+        </w:rPr>
+        <w:t xml:space="preserve">            int p = (aInv * ((cipher - b) % N + N)) % N;</w:t>
+      </w:r>
+      <w:r>
+        <w:br/>
+      </w:r>
+      <w:r>
+        <w:rPr>
+          <w:rStyle w:val="VerbatimChar"/>
+        </w:rPr>
+        <w:t xml:space="preserve">            result += static_cast&lt;char&gt;(p + 'A');</w:t>
+      </w:r>
+      <w:r>
+        <w:br/>
+      </w:r>
+      <w:r>
+        <w:rPr>
+          <w:rStyle w:val="VerbatimChar"/>
+        </w:rPr>
+        <w:t xml:space="preserve">        } else {</w:t>
+      </w:r>
+      <w:r>
+        <w:br/>
+      </w:r>
+      <w:r>
+        <w:rPr>
+          <w:rStyle w:val="VerbatimChar"/>
+        </w:rPr>
+        <w:t xml:space="preserve">            result += c;</w:t>
+      </w:r>
+      <w:r>
+        <w:br/>
+      </w:r>
+      <w:r>
+        <w:rPr>
+          <w:rStyle w:val="VerbatimChar"/>
+        </w:rPr>
+        <w:t xml:space="preserve">        }</w:t>
+      </w:r>
+      <w:r>
+        <w:br/>
+      </w:r>
+      <w:r>
+        <w:rPr>
+          <w:rStyle w:val="VerbatimChar"/>
+        </w:rPr>
+        <w:t xml:space="preserve">    }</w:t>
+      </w:r>
+      <w:r>
+        <w:br/>
+      </w:r>
+      <w:r>
+        <w:rPr>
+          <w:rStyle w:val="VerbatimChar"/>
+        </w:rPr>
+        <w:t xml:space="preserve">    return result;</w:t>
+      </w:r>
+      <w:r>
+        <w:br/>
+      </w:r>
+      <w:r>
+        <w:rPr>
+          <w:rStyle w:val="VerbatimChar"/>
+        </w:rPr>
+        <w:t xml:space="preserve">}</w:t>
+      </w:r>
+      <w:r>
+        <w:br/>
+      </w:r>
+      <w:r>
+        <w:br/>
+      </w:r>
+      <w:r>
+        <w:rPr>
+          <w:rStyle w:val="VerbatimChar"/>
+        </w:rPr>
+        <w:t xml:space="preserve">int main() {</w:t>
+      </w:r>
+      <w:r>
+        <w:br/>
+      </w:r>
+      <w:r>
+        <w:rPr>
+          <w:rStyle w:val="VerbatimChar"/>
+        </w:rPr>
+        <w:t xml:space="preserve">    int a = 5, b = 8;</w:t>
+      </w:r>
+      <w:r>
+        <w:br/>
+      </w:r>
+      <w:r>
+        <w:rPr>
+          <w:rStyle w:val="VerbatimChar"/>
+        </w:rPr>
+        <w:t xml:space="preserve">    std::string plaintext = "AFFINE CIPHER";</w:t>
+      </w:r>
+      <w:r>
+        <w:br/>
+      </w:r>
+      <w:r>
+        <w:br/>
+      </w:r>
+      <w:r>
+        <w:rPr>
+          <w:rStyle w:val="VerbatimChar"/>
+        </w:rPr>
+        <w:t xml:space="preserve">    std::cout &lt;&lt; "Афінний шифр: a=" &lt;&lt; a &lt;&lt; ", b=" &lt;&lt; b &lt;&lt; "\n";</w:t>
+      </w:r>
+      <w:r>
+        <w:br/>
+      </w:r>
+      <w:r>
+        <w:rPr>
+          <w:rStyle w:val="VerbatimChar"/>
+        </w:rPr>
+        <w:t xml:space="preserve">    std::cout &lt;&lt; "Перевірка:    gcd(" &lt;&lt; a &lt;&lt; ", " &lt;&lt; N &lt;&lt; ") = " &lt;&lt; gcd(a, N) &lt;&lt; "\n";</w:t>
+      </w:r>
+      <w:r>
+        <w:br/>
+      </w:r>
+      <w:r>
+        <w:rPr>
+          <w:rStyle w:val="VerbatimChar"/>
+        </w:rPr>
+        <w:t xml:space="preserve">    std::cout &lt;&lt; "Обернений:    " &lt;&lt; a &lt;&lt; "^-1 mod " &lt;&lt; N &lt;&lt; " = " &lt;&lt; modInverse(a, N) &lt;&lt; "\n\n";</w:t>
+      </w:r>
+      <w:r>
+        <w:br/>
+      </w:r>
+      <w:r>
+        <w:br/>
+      </w:r>
+      <w:r>
+        <w:rPr>
+          <w:rStyle w:val="VerbatimChar"/>
+        </w:rPr>
+        <w:t xml:space="preserve">    std::cout &lt;&lt; "Відкритий текст:  " &lt;&lt; plaintext &lt;&lt; "\n";</w:t>
+      </w:r>
+      <w:r>
+        <w:br/>
+      </w:r>
+      <w:r>
+        <w:br/>
+      </w:r>
+      <w:r>
+        <w:rPr>
+          <w:rStyle w:val="VerbatimChar"/>
+        </w:rPr>
+        <w:t xml:space="preserve">    std::string ciphertext = affineEncrypt(plaintext, a, b);</w:t>
+      </w:r>
+      <w:r>
+        <w:br/>
+      </w:r>
+      <w:r>
+        <w:rPr>
+          <w:rStyle w:val="VerbatimChar"/>
+        </w:rPr>
+        <w:t xml:space="preserve">    std::cout &lt;&lt; "Шифротекст:       " &lt;&lt; ciphertext &lt;&lt; "\n";</w:t>
+      </w:r>
+      <w:r>
+        <w:br/>
+      </w:r>
+      <w:r>
+        <w:rPr>
+          <w:rStyle w:val="VerbatimChar"/>
+        </w:rPr>
+        <w:t xml:space="preserve">    std::cout &lt;&lt; "Розшифровано:     " &lt;&lt; affineDecrypt(ciphertext, a, b) &lt;&lt; "\n";</w:t>
+      </w:r>
+      <w:r>
+        <w:br/>
+      </w:r>
+      <w:r>
+        <w:br/>
+      </w:r>
+      <w:r>
+        <w:rPr>
+          <w:rStyle w:val="VerbatimChar"/>
+        </w:rPr>
+        <w:t xml:space="preserve">    return 0;</w:t>
+      </w:r>
+      <w:r>
+        <w:br/>
+      </w:r>
+      <w:r>
+        <w:rPr>
+          <w:rStyle w:val="VerbatimChar"/>
+        </w:rPr>
+        <w:t xml:space="preserve">}</w:t>
       </w:r>
     </w:p>
     <w:p>
@@ -1536,11 +1888,7 @@
         <w:pStyle w:val="FirstParagraph"/>
       </w:pPr>
       <w:r>
-        <w:rPr>
-          <w:b/>
-          <w:bCs/>
-        </w:rPr>
-        <w:t xml:space="preserve">Очікуваний результат:</w:t>
+        <w:t xml:space="preserve">Результат роботи програми:</w:t>
       </w:r>
     </w:p>
     <w:p>
@@ -1551,54 +1899,6 @@
         <w:rPr>
           <w:rStyle w:val="VerbatimChar"/>
         </w:rPr>
-        <w:t xml:space="preserve">Ключове слово: CIPHER</w:t>
-      </w:r>
-      <w:r>
-        <w:br/>
-      </w:r>
-      <w:r>
-        <w:rPr>
-          <w:rStyle w:val="VerbatimChar"/>
-        </w:rPr>
-        <w:t xml:space="preserve">Алфавіт: CIPHERABDFGJKLMNOQSTUVWXYZ</w:t>
-      </w:r>
-      <w:r>
-        <w:br/>
-      </w:r>
-      <w:r>
-        <w:rPr>
-          <w:rStyle w:val="VerbatimChar"/>
-        </w:rPr>
-        <w:t xml:space="preserve">Відкритий текст: HELLO WORLD</w:t>
-      </w:r>
-      <w:r>
-        <w:br/>
-      </w:r>
-      <w:r>
-        <w:rPr>
-          <w:rStyle w:val="VerbatimChar"/>
-        </w:rPr>
-        <w:t xml:space="preserve">Шифротекст: BEJJM WMQJH</w:t>
-      </w:r>
-      <w:r>
-        <w:br/>
-      </w:r>
-      <w:r>
-        <w:rPr>
-          <w:rStyle w:val="VerbatimChar"/>
-        </w:rPr>
-        <w:t xml:space="preserve">Розшифровано: HELLO WORLD</w:t>
-      </w:r>
-      <w:r>
-        <w:br/>
-      </w:r>
-      <w:r>
-        <w:br/>
-      </w:r>
-      <w:r>
-        <w:rPr>
-          <w:rStyle w:val="VerbatimChar"/>
-        </w:rPr>
         <w:t xml:space="preserve">Афінний шифр: a=5, b=8</w:t>
       </w:r>
       <w:r>
@@ -1608,57 +1908,78 @@
         <w:rPr>
           <w:rStyle w:val="VerbatimChar"/>
         </w:rPr>
-        <w:t xml:space="preserve">Перевірка: gcd(5, 26) = 1</w:t>
-      </w:r>
-      <w:r>
-        <w:br/>
-      </w:r>
-      <w:r>
-        <w:rPr>
-          <w:rStyle w:val="VerbatimChar"/>
-        </w:rPr>
-        <w:t xml:space="preserve">Обернений: 5⁻¹ mod 26 = 21</w:t>
-      </w:r>
-      <w:r>
-        <w:br/>
-      </w:r>
-      <w:r>
-        <w:br/>
-      </w:r>
-      <w:r>
-        <w:rPr>
-          <w:rStyle w:val="VerbatimChar"/>
-        </w:rPr>
-        <w:t xml:space="preserve">Відкритий текст: AFFINE CIPHER</w:t>
-      </w:r>
-      <w:r>
-        <w:br/>
-      </w:r>
-      <w:r>
-        <w:rPr>
-          <w:rStyle w:val="VerbatimChar"/>
-        </w:rPr>
-        <w:t xml:space="preserve">Шифротекст: IRRWVC SWFRCP</w:t>
-      </w:r>
-      <w:r>
-        <w:br/>
-      </w:r>
-      <w:r>
-        <w:rPr>
-          <w:rStyle w:val="VerbatimChar"/>
-        </w:rPr>
-        <w:t xml:space="preserve">Розшифровано: AFFINE CIPHER</w:t>
-      </w:r>
-    </w:p>
-    <w:bookmarkEnd w:id="14"/>
-    <w:bookmarkEnd w:id="15"/>
-    <w:bookmarkStart w:id="16" w:name="порядок-виконання-роботи"/>
-    <w:p>
-      <w:pPr>
-        <w:pStyle w:val="Heading2"/>
-      </w:pPr>
-      <w:r>
-        <w:t xml:space="preserve">Порядок виконання роботи</w:t>
+        <w:t xml:space="preserve">Перевірка:    gcd(5, 26) = 1</w:t>
+      </w:r>
+      <w:r>
+        <w:br/>
+      </w:r>
+      <w:r>
+        <w:rPr>
+          <w:rStyle w:val="VerbatimChar"/>
+        </w:rPr>
+        <w:t xml:space="preserve">Обернений:    5^-1 mod 26 = 21</w:t>
+      </w:r>
+      <w:r>
+        <w:br/>
+      </w:r>
+      <w:r>
+        <w:br/>
+      </w:r>
+      <w:r>
+        <w:rPr>
+          <w:rStyle w:val="VerbatimChar"/>
+        </w:rPr>
+        <w:t xml:space="preserve">Відкритий текст:  AFFINE CIPHER</w:t>
+      </w:r>
+      <w:r>
+        <w:br/>
+      </w:r>
+      <w:r>
+        <w:rPr>
+          <w:rStyle w:val="VerbatimChar"/>
+        </w:rPr>
+        <w:t xml:space="preserve">Шифротекст:       IHHWVC SWFRCP</w:t>
+      </w:r>
+      <w:r>
+        <w:br/>
+      </w:r>
+      <w:r>
+        <w:rPr>
+          <w:rStyle w:val="VerbatimChar"/>
+        </w:rPr>
+        <w:t xml:space="preserve">Розшифровано:     AFFINE CIPHER</w:t>
+      </w:r>
+    </w:p>
+    <w:p>
+      <w:pPr>
+        <w:pStyle w:val="FirstParagraph"/>
+      </w:pPr>
+      <w:r>
+        <w:t xml:space="preserve">Перші дві літери шифротексту варто перевірити вручну: A має номер 0, тож</w:t>
+      </w:r>
+      <w:r>
+        <w:t xml:space="preserve"> </w:t>
+      </w:r>
+      <w:r>
+        <w:t xml:space="preserve">5·0 + 8 = 8, а це I; F має номер 5, тож 5·5 + 8 = 33, а 33 mod 26 = 7, тобто H.</w:t>
+      </w:r>
+      <w:r>
+        <w:t xml:space="preserve"> </w:t>
+      </w:r>
+      <w:r>
+        <w:t xml:space="preserve">Дві однакові літери FF дають однакові IH — афінний шифр лишається шифром</w:t>
+      </w:r>
+      <w:r>
+        <w:t xml:space="preserve"> </w:t>
+      </w:r>
+      <w:r>
+        <w:t xml:space="preserve">простої заміни з усіма його слабкостями.</w:t>
+      </w:r>
+      <w:r>
+        <w:t xml:space="preserve"> </w:t>
+      </w:r>
+      <w:r>
+        <w:t xml:space="preserve">## Порядок виконання роботи</w:t>
       </w:r>
     </w:p>
     <w:p>
@@ -1757,8 +2078,9 @@
         <w:t xml:space="preserve">Оформити звіт та зробити висновок.</w:t>
       </w:r>
     </w:p>
-    <w:bookmarkEnd w:id="16"/>
-    <w:bookmarkStart w:id="17" w:name="вимоги-до-звіту"/>
+    <w:bookmarkEnd w:id="14"/>
+    <w:bookmarkEnd w:id="15"/>
+    <w:bookmarkStart w:id="16" w:name="вимоги-до-звіту"/>
     <w:p>
       <w:pPr>
         <w:pStyle w:val="Heading2"/>
@@ -1853,8 +2175,8 @@
         <w:t xml:space="preserve">висновок.</w:t>
       </w:r>
     </w:p>
-    <w:bookmarkEnd w:id="17"/>
-    <w:bookmarkStart w:id="18" w:name="варіанти-індивідуальних-завдань"/>
+    <w:bookmarkEnd w:id="16"/>
+    <w:bookmarkStart w:id="17" w:name="варіанти-індивідуальних-завдань"/>
     <w:p>
       <w:pPr>
         <w:pStyle w:val="Heading2"/>
@@ -3078,14 +3400,31 @@
         </w:tc>
       </w:tr>
     </w:tbl>
-    <w:bookmarkEnd w:id="18"/>
-    <w:bookmarkStart w:id="19" w:name="контрольні-запитання"/>
+    <w:bookmarkEnd w:id="17"/>
+    <w:bookmarkStart w:id="21" w:name="контрольні-запитання"/>
     <w:p>
       <w:pPr>
         <w:pStyle w:val="Heading2"/>
       </w:pPr>
       <w:r>
         <w:t xml:space="preserve">Контрольні запитання</w:t>
+      </w:r>
+    </w:p>
+    <w:p>
+      <w:pPr>
+        <w:pStyle w:val="FirstParagraph"/>
+      </w:pPr>
+      <w:r>
+        <w:t xml:space="preserve">Запитання згруповано за рівнями навчальних досягнень. Для позитивної оцінки студент має відповісти на запитання середнього рівня, оцінка «добре» потребує відповідей достатнього рівня, оцінка «відмінно» — високого.</w:t>
+      </w:r>
+    </w:p>
+    <w:bookmarkStart w:id="18" w:name="середній-рівень-репродуктивний"/>
+    <w:p>
+      <w:pPr>
+        <w:pStyle w:val="Heading3"/>
+      </w:pPr>
+      <w:r>
+        <w:t xml:space="preserve">Середній рівень (репродуктивний)</w:t>
       </w:r>
     </w:p>
     <w:p>
@@ -3098,7 +3437,7 @@
         <w:jc w:val="both"/>
       </w:pPr>
       <w:r>
-        <w:t xml:space="preserve">Як формується алфавіт з ключовим словом?</w:t>
+        <w:t xml:space="preserve">Як формується шифрувальний алфавіт з ключовим словом?</w:t>
       </w:r>
     </w:p>
     <w:p>
@@ -3111,7 +3450,7 @@
         <w:jc w:val="both"/>
       </w:pPr>
       <w:r>
-        <w:t xml:space="preserve">Які вимоги до параметра a в афінному шифрі?</w:t>
+        <w:t xml:space="preserve">Запишіть формулу зашифрування афінного шифру.</w:t>
       </w:r>
     </w:p>
     <w:p>
@@ -3124,7 +3463,7 @@
         <w:jc w:val="both"/>
       </w:pPr>
       <w:r>
-        <w:t xml:space="preserve">Як знайти обернений елемент за модулем?</w:t>
+        <w:t xml:space="preserve">Які вимоги висуваються до параметра a в афінному шифрі?</w:t>
       </w:r>
     </w:p>
     <w:p>
@@ -3137,7 +3476,7 @@
         <w:jc w:val="both"/>
       </w:pPr>
       <w:r>
-        <w:t xml:space="preserve">Скільки існує ключів для афінного шифру з алфавітом 26 літер?</w:t>
+        <w:t xml:space="preserve">Що таке обернений елемент за модулем?</w:t>
       </w:r>
     </w:p>
     <w:p>
@@ -3150,7 +3489,7 @@
         <w:jc w:val="both"/>
       </w:pPr>
       <w:r>
-        <w:t xml:space="preserve">Чому a=2 не підходить для афінного шифру?</w:t>
+        <w:t xml:space="preserve">Що таке функція Ейлера φ(n)?</w:t>
       </w:r>
     </w:p>
     <w:p>
@@ -3163,7 +3502,7 @@
         <w:jc w:val="both"/>
       </w:pPr>
       <w:r>
-        <w:t xml:space="preserve">Що таке функція Ейлера φ(n)?</w:t>
+        <w:t xml:space="preserve">Скільки існує ключів для афінного шифру з алфавітом 26 літер?</w:t>
       </w:r>
     </w:p>
     <w:p>
@@ -3176,10 +3515,200 @@
         <w:jc w:val="both"/>
       </w:pPr>
       <w:r>
-        <w:t xml:space="preserve">Як перевірити правильність дешифрування?</w:t>
+        <w:t xml:space="preserve">Що відбувається з повторюваними літерами ключового слова?</w:t>
+      </w:r>
+    </w:p>
+    <w:p>
+      <w:pPr>
+        <w:pStyle w:val="Compact"/>
+        <w:numPr>
+          <w:ilvl w:val="0"/>
+          <w:numId w:val="1005"/>
+        </w:numPr>
+        <w:jc w:val="both"/>
+      </w:pPr>
+      <w:r>
+        <w:t xml:space="preserve">Як перевірити правильність дешифрування отриманого тексту?</w:t>
+      </w:r>
+    </w:p>
+    <w:bookmarkEnd w:id="18"/>
+    <w:bookmarkStart w:id="19" w:name="Xf8a59b0220f3a7cb520922cfcf2989f7f66f7c3"/>
+    <w:p>
+      <w:pPr>
+        <w:pStyle w:val="Heading3"/>
+      </w:pPr>
+      <w:r>
+        <w:t xml:space="preserve">Достатній рівень (конструктивно-варіативний)</w:t>
+      </w:r>
+    </w:p>
+    <w:p>
+      <w:pPr>
+        <w:pStyle w:val="Compact"/>
+        <w:numPr>
+          <w:ilvl w:val="0"/>
+          <w:numId w:val="1006"/>
+        </w:numPr>
+        <w:jc w:val="both"/>
+      </w:pPr>
+      <w:r>
+        <w:t xml:space="preserve">Чому значення a = 2 не підходить для афінного шифру з алфавітом із 26 літер?</w:t>
+      </w:r>
+    </w:p>
+    <w:p>
+      <w:pPr>
+        <w:pStyle w:val="Compact"/>
+        <w:numPr>
+          <w:ilvl w:val="0"/>
+          <w:numId w:val="1006"/>
+        </w:numPr>
+        <w:jc w:val="both"/>
+      </w:pPr>
+      <w:r>
+        <w:t xml:space="preserve">Як знайти обернений елемент за модулем розширеним алгоритмом Евкліда?</w:t>
+      </w:r>
+    </w:p>
+    <w:p>
+      <w:pPr>
+        <w:pStyle w:val="Compact"/>
+        <w:numPr>
+          <w:ilvl w:val="0"/>
+          <w:numId w:val="1006"/>
+        </w:numPr>
+        <w:jc w:val="both"/>
+      </w:pPr>
+      <w:r>
+        <w:t xml:space="preserve">Чому кількість ключів афінного шифру дорівнює φ(n)·n, а не n²?</w:t>
+      </w:r>
+    </w:p>
+    <w:p>
+      <w:pPr>
+        <w:pStyle w:val="Compact"/>
+        <w:numPr>
+          <w:ilvl w:val="0"/>
+          <w:numId w:val="1006"/>
+        </w:numPr>
+        <w:jc w:val="both"/>
+      </w:pPr>
+      <w:r>
+        <w:t xml:space="preserve">Чим шифр Цезаря є окремим випадком афінного шифру? Які значення параметрів йому відповідають?</w:t>
+      </w:r>
+    </w:p>
+    <w:p>
+      <w:pPr>
+        <w:pStyle w:val="Compact"/>
+        <w:numPr>
+          <w:ilvl w:val="0"/>
+          <w:numId w:val="1006"/>
+        </w:numPr>
+        <w:jc w:val="both"/>
+      </w:pPr>
+      <w:r>
+        <w:t xml:space="preserve">Як зміниться ключовий простір, якщо перейти на українську абетку з 33 літер?</w:t>
+      </w:r>
+    </w:p>
+    <w:p>
+      <w:pPr>
+        <w:pStyle w:val="Compact"/>
+        <w:numPr>
+          <w:ilvl w:val="0"/>
+          <w:numId w:val="1006"/>
+        </w:numPr>
+        <w:jc w:val="both"/>
+      </w:pPr>
+      <w:r>
+        <w:t xml:space="preserve">Запишіть формулу розшифрування афінного шифру й поясніть роль оберненого елемента.</w:t>
+      </w:r>
+    </w:p>
+    <w:p>
+      <w:pPr>
+        <w:pStyle w:val="Compact"/>
+        <w:numPr>
+          <w:ilvl w:val="0"/>
+          <w:numId w:val="1006"/>
+        </w:numPr>
+        <w:jc w:val="both"/>
+      </w:pPr>
+      <w:r>
+        <w:t xml:space="preserve">Чому шифр з ключовим словом складніше зламати повним перебором, ніж шифр Цезаря?</w:t>
+      </w:r>
+    </w:p>
+    <w:p>
+      <w:pPr>
+        <w:pStyle w:val="Compact"/>
+        <w:numPr>
+          <w:ilvl w:val="0"/>
+          <w:numId w:val="1006"/>
+        </w:numPr>
+        <w:jc w:val="both"/>
+      </w:pPr>
+      <w:r>
+        <w:t xml:space="preserve">Як частотний аналіз застосовують до афінного шифру?</w:t>
       </w:r>
     </w:p>
     <w:bookmarkEnd w:id="19"/>
+    <w:bookmarkStart w:id="20" w:name="високий-рівень-творчий"/>
+    <w:p>
+      <w:pPr>
+        <w:pStyle w:val="Heading3"/>
+      </w:pPr>
+      <w:r>
+        <w:t xml:space="preserve">Високий рівень (творчий)</w:t>
+      </w:r>
+    </w:p>
+    <w:p>
+      <w:pPr>
+        <w:pStyle w:val="Compact"/>
+        <w:numPr>
+          <w:ilvl w:val="0"/>
+          <w:numId w:val="1007"/>
+        </w:numPr>
+        <w:jc w:val="both"/>
+      </w:pPr>
+      <w:r>
+        <w:t xml:space="preserve">Поясніть, чому обидва розглянуті шифри лишаються моноалфавітними, і які наслідки це має для їхньої стійкості.</w:t>
+      </w:r>
+    </w:p>
+    <w:p>
+      <w:pPr>
+        <w:pStyle w:val="Compact"/>
+        <w:numPr>
+          <w:ilvl w:val="0"/>
+          <w:numId w:val="1007"/>
+        </w:numPr>
+        <w:jc w:val="both"/>
+      </w:pPr>
+      <w:r>
+        <w:t xml:space="preserve">Запропонуйте спосіб автоматично визначити параметри a і b афінного шифру за шифротекстом достатньої довжини.</w:t>
+      </w:r>
+    </w:p>
+    <w:p>
+      <w:pPr>
+        <w:pStyle w:val="Compact"/>
+        <w:numPr>
+          <w:ilvl w:val="0"/>
+          <w:numId w:val="1007"/>
+        </w:numPr>
+        <w:jc w:val="both"/>
+      </w:pPr>
+      <w:r>
+        <w:t xml:space="preserve">Оцініть, наскільки зросте стійкість, якщо застосувати афінний шифр двічі з різними ключами. Обґрунтуйте відповідь.</w:t>
+      </w:r>
+    </w:p>
+    <w:p>
+      <w:pPr>
+        <w:pStyle w:val="Compact"/>
+        <w:numPr>
+          <w:ilvl w:val="0"/>
+          <w:numId w:val="1007"/>
+        </w:numPr>
+        <w:jc w:val="both"/>
+      </w:pPr>
+      <w:r>
+        <w:t xml:space="preserve">Сформулюйте вимоги до вибору ключового слова, за яких шифр з ключовим словом дає найбільший ефект.</w:t>
+      </w:r>
+    </w:p>
+    <w:bookmarkEnd w:id="20"/>
+    <w:bookmarkEnd w:id="21"/>
     <w:sectPr>
       <w:pgSz w:h="16838" w:orient="portrait" w:w="11906"/>
       <w:pgMar w:bottom="1134" w:footer="708" w:gutter="0" w:header="708" w:left="1418" w:right="851" w:top="1134"/>
@@ -3537,6 +4066,66 @@
     <w:abstractNumId w:val="991"/>
   </w:num>
   <w:num w:numId="1005">
+    <w:abstractNumId w:val="99411"/>
+    <w:lvlOverride w:ilvl="0">
+      <w:startOverride w:val="1"/>
+    </w:lvlOverride>
+    <w:lvlOverride w:ilvl="1">
+      <w:startOverride w:val="1"/>
+    </w:lvlOverride>
+    <w:lvlOverride w:ilvl="2">
+      <w:startOverride w:val="1"/>
+    </w:lvlOverride>
+    <w:lvlOverride w:ilvl="3">
+      <w:startOverride w:val="1"/>
+    </w:lvlOverride>
+    <w:lvlOverride w:ilvl="4">
+      <w:startOverride w:val="1"/>
+    </w:lvlOverride>
+    <w:lvlOverride w:ilvl="5">
+      <w:startOverride w:val="1"/>
+    </w:lvlOverride>
+    <w:lvlOverride w:ilvl="6">
+      <w:startOverride w:val="1"/>
+    </w:lvlOverride>
+    <w:lvlOverride w:ilvl="7">
+      <w:startOverride w:val="1"/>
+    </w:lvlOverride>
+    <w:lvlOverride w:ilvl="8">
+      <w:startOverride w:val="1"/>
+    </w:lvlOverride>
+  </w:num>
+  <w:num w:numId="1006">
+    <w:abstractNumId w:val="99411"/>
+    <w:lvlOverride w:ilvl="0">
+      <w:startOverride w:val="1"/>
+    </w:lvlOverride>
+    <w:lvlOverride w:ilvl="1">
+      <w:startOverride w:val="1"/>
+    </w:lvlOverride>
+    <w:lvlOverride w:ilvl="2">
+      <w:startOverride w:val="1"/>
+    </w:lvlOverride>
+    <w:lvlOverride w:ilvl="3">
+      <w:startOverride w:val="1"/>
+    </w:lvlOverride>
+    <w:lvlOverride w:ilvl="4">
+      <w:startOverride w:val="1"/>
+    </w:lvlOverride>
+    <w:lvlOverride w:ilvl="5">
+      <w:startOverride w:val="1"/>
+    </w:lvlOverride>
+    <w:lvlOverride w:ilvl="6">
+      <w:startOverride w:val="1"/>
+    </w:lvlOverride>
+    <w:lvlOverride w:ilvl="7">
+      <w:startOverride w:val="1"/>
+    </w:lvlOverride>
+    <w:lvlOverride w:ilvl="8">
+      <w:startOverride w:val="1"/>
+    </w:lvlOverride>
+  </w:num>
+  <w:num w:numId="1007">
     <w:abstractNumId w:val="99411"/>
     <w:lvlOverride w:ilvl="0">
       <w:startOverride w:val="1"/>

</xml_diff>